<commit_message>
seminar 7: team leads per seminar 1 roles, drop headcount model; seminar 5: estimation wording
Co-Authored-By: Claude Opus 5.5 <noreply@anthropic.com>
</commit_message>
<xml_diff>
--- a/docs/seminar_7/seminar_7.docx
+++ b/docs/seminar_7/seminar_7.docx
@@ -29,13 +29,13 @@
         <w:rPr>
           <w:rStyle w:val="VerbatimChar"/>
         </w:rPr>
-        <w:t xml:space="preserve">v1.0</w:t>
-      </w:r>
-      <w:r>
-        <w:t xml:space="preserve"> </w:t>
-      </w:r>
-      <w:r>
-        <w:t xml:space="preserve">(21.10.2026)</w:t>
+        <w:t xml:space="preserve">v1.1</w:t>
+      </w:r>
+      <w:r>
+        <w:t xml:space="preserve"> </w:t>
+      </w:r>
+      <w:r>
+        <w:t xml:space="preserve">(22.10.2026)</w:t>
       </w:r>
       <w:r>
         <w:br/>
@@ -91,7 +91,7 @@
         <w:pStyle w:val="FirstParagraph"/>
       </w:pPr>
       <w:r>
-        <w:t xml:space="preserve">Смоделировать, как EcoGrid Flow будет развиваться, когда над ним работает не одна команда из пяти человек, а несколько команд: разделить систему на функциональные области, закрепить их за командами, выделить общие компоненты и контракты обмена данными, построить карту межкомандных зависимостей и договориться о единых правилах совместной разработки и интеграции.</w:t>
+        <w:t xml:space="preserve">Смоделировать, как была бы устроена разработка EcoGrid Flow, если бы над ним работала не одна команда, а несколько: разделить систему на функциональные области, закрепить их за командами, выделить общие компоненты и контракты обмена данными, построить карту межкомандных зависимостей и договориться о единых правилах совместной разработки и интеграции.</w:t>
       </w:r>
     </w:p>
     <w:p>
@@ -123,7 +123,7 @@
         </w:r>
       </w:hyperlink>
       <w:r>
-        <w:t xml:space="preserve">). Во втором семестре (Release 1.0: ML-прогноз цен, интеграция с Airflow) к проекту могут присоединиться новые участники, и правила из этого документа позволят им работать без постоянной ручной координации.</w:t>
+        <w:t xml:space="preserve">). Во втором семестре (Release 1.0: ML-прогноз цен, интеграция с Airflow) объем работ вырастет, и эти правила позволят развивать области параллельно, не мешая друг другу.</w:t>
       </w:r>
     </w:p>
     <w:p>
@@ -135,7 +135,27 @@
           <w:b/>
           <w:bCs/>
         </w:rPr>
-        <w:t xml:space="preserve">Модель роста.</w:t>
+        <w:t xml:space="preserve">Модель масштабирования.</w:t>
+      </w:r>
+      <w:r>
+        <w:t xml:space="preserve"> </w:t>
+      </w:r>
+      <w:r>
+        <w:t xml:space="preserve">Это модель по заданию семинара, а не план набора людей: состав команды проекта — 5 человек (устав,</w:t>
+      </w:r>
+      <w:r>
+        <w:t xml:space="preserve"> </w:t>
+      </w:r>
+      <w:hyperlink r:id="rId31">
+        <w:r>
+          <w:rPr>
+            <w:rStyle w:val="Hyperlink"/>
+          </w:rPr>
+          <w:t xml:space="preserve">семинар 5</w:t>
+        </w:r>
+      </w:hyperlink>
+      <w:r>
+        <w:t xml:space="preserve">).</w:t>
       </w:r>
     </w:p>
     <w:tbl>
@@ -245,31 +265,31 @@
                 <w:b/>
                 <w:bCs/>
               </w:rPr>
-              <w:t xml:space="preserve">Рост</w:t>
-            </w:r>
-          </w:p>
-        </w:tc>
-        <w:tc>
-          <w:tcPr/>
-          <w:p>
-            <w:pPr>
-              <w:pStyle w:val="Compact"/>
-              <w:jc w:val="left"/>
-            </w:pPr>
-            <w:r>
-              <w:t xml:space="preserve">2-й семестр, Release 1.0 (май 2027)</w:t>
-            </w:r>
-          </w:p>
-        </w:tc>
-        <w:tc>
-          <w:tcPr/>
-          <w:p>
-            <w:pPr>
-              <w:pStyle w:val="Compact"/>
-              <w:jc w:val="left"/>
-            </w:pPr>
-            <w:r>
-              <w:t xml:space="preserve">4 команды по 3–4 человека, всего 13–14 человек. Нынешние участники становятся лидами команд, новые участники приходят в команды областей</w:t>
+              <w:t xml:space="preserve">Модель</w:t>
+            </w:r>
+          </w:p>
+        </w:tc>
+        <w:tc>
+          <w:tcPr/>
+          <w:p>
+            <w:pPr>
+              <w:pStyle w:val="Compact"/>
+              <w:jc w:val="left"/>
+            </w:pPr>
+            <w:r>
+              <w:t xml:space="preserve">Если проект вырастет до нескольких команд</w:t>
+            </w:r>
+          </w:p>
+        </w:tc>
+        <w:tc>
+          <w:tcPr/>
+          <w:p>
+            <w:pPr>
+              <w:pStyle w:val="Compact"/>
+              <w:jc w:val="left"/>
+            </w:pPr>
+            <w:r>
+              <w:t xml:space="preserve">Каждая функциональная область становится отдельной командой со своим лидом. Лиды — нынешние участники по их ролям из семинара 1. Контракты, правила интеграции и роли координации остаются теми же</w:t>
             </w:r>
           </w:p>
         </w:tc>
@@ -1171,7 +1191,7 @@
         <w:pStyle w:val="FirstParagraph"/>
       </w:pPr>
       <w:r>
-        <w:t xml:space="preserve">Одна команда — одна область. Команда владеет своими компонентами целиком: пишет код, тестирует его и ведет документацию. Состав «Сейчас» — кто ведет область в первом семестре; «При росте» — модель для Release 1.0 (новые роли — вакансии, имена появятся при наборе).</w:t>
+        <w:t xml:space="preserve">Одна команда — одна область. Команда владеет своими компонентами целиком: пишет код, тестирует его и ведет документацию. Лиды назначены по ролям из семинара 1; колонка «Сейчас» показывает, кто ведет работу области в первом семестре.</w:t>
       </w:r>
     </w:p>
     <w:tbl>
@@ -1181,12 +1201,11 @@
         <w:tblLook w:firstRow="1" w:lastRow="0" w:firstColumn="0" w:lastColumn="0" w:noHBand="0" w:noVBand="0" w:val="0020"/>
       </w:tblPr>
       <w:tblGrid>
-        <w:gridCol w:w="1320"/>
-        <w:gridCol w:w="1320"/>
-        <w:gridCol w:w="1320"/>
-        <w:gridCol w:w="1320"/>
-        <w:gridCol w:w="1320"/>
-        <w:gridCol w:w="1320"/>
+        <w:gridCol w:w="1584"/>
+        <w:gridCol w:w="1584"/>
+        <w:gridCol w:w="1584"/>
+        <w:gridCol w:w="1584"/>
+        <w:gridCol w:w="1584"/>
       </w:tblGrid>
       <w:tr>
         <w:trPr>
@@ -1248,18 +1267,6 @@
               <w:jc w:val="left"/>
             </w:pPr>
             <w:r>
-              <w:t xml:space="preserve">При росте (Release 1.0)</w:t>
-            </w:r>
-          </w:p>
-        </w:tc>
-        <w:tc>
-          <w:tcPr/>
-          <w:p>
-            <w:pPr>
-              <w:pStyle w:val="Compact"/>
-              <w:jc w:val="left"/>
-            </w:pPr>
-            <w:r>
               <w:t xml:space="preserve">Главный результат</w:t>
             </w:r>
           </w:p>
@@ -1332,18 +1339,6 @@
               <w:jc w:val="left"/>
             </w:pPr>
             <w:r>
-              <w:t xml:space="preserve">Лид + 2 дата-инженера</w:t>
-            </w:r>
-          </w:p>
-        </w:tc>
-        <w:tc>
-          <w:tcPr/>
-          <w:p>
-            <w:pPr>
-              <w:pStyle w:val="Compact"/>
-              <w:jc w:val="left"/>
-            </w:pPr>
-            <w:r>
               <w:t xml:space="preserve">Полные и проверенные ряды цен и погоды</w:t>
             </w:r>
           </w:p>
@@ -1416,18 +1411,6 @@
               <w:jc w:val="left"/>
             </w:pPr>
             <w:r>
-              <w:t xml:space="preserve">Лид + Data Scientist + Python-разработчик</w:t>
-            </w:r>
-          </w:p>
-        </w:tc>
-        <w:tc>
-          <w:tcPr/>
-          <w:p>
-            <w:pPr>
-              <w:pStyle w:val="Compact"/>
-              <w:jc w:val="left"/>
-            </w:pPr>
-            <w:r>
               <w:t xml:space="preserve">Рекомендация «когда и где», не нарушающая дедлайн</w:t>
             </w:r>
           </w:p>
@@ -1476,7 +1459,7 @@
               <w:jc w:val="left"/>
             </w:pPr>
             <w:r>
-              <w:t xml:space="preserve">Максим Томов</w:t>
+              <w:t xml:space="preserve">Александр Зейферт (бэкенд); лид фронтенда — Максим Томов</w:t>
             </w:r>
           </w:p>
         </w:tc>
@@ -1489,18 +1472,6 @@
             </w:pPr>
             <w:r>
               <w:t xml:space="preserve">Александр (API), Максим (веб)</w:t>
-            </w:r>
-          </w:p>
-        </w:tc>
-        <w:tc>
-          <w:tcPr/>
-          <w:p>
-            <w:pPr>
-              <w:pStyle w:val="Compact"/>
-              <w:jc w:val="left"/>
-            </w:pPr>
-            <w:r>
-              <w:t xml:space="preserve">Лид (фронтенд) + бэкенд-разработчик + фронтенд-разработчик</w:t>
             </w:r>
           </w:p>
         </w:tc>
@@ -1560,31 +1531,19 @@
               <w:jc w:val="left"/>
             </w:pPr>
             <w:r>
-              <w:t xml:space="preserve">Александр Зейферт</w:t>
-            </w:r>
-          </w:p>
-        </w:tc>
-        <w:tc>
-          <w:tcPr/>
-          <w:p>
-            <w:pPr>
-              <w:pStyle w:val="Compact"/>
-              <w:jc w:val="left"/>
-            </w:pPr>
-            <w:r>
-              <w:t xml:space="preserve">Александр (база, CI, стек), Григорий (тесты, приемка)</w:t>
-            </w:r>
-          </w:p>
-        </w:tc>
-        <w:tc>
-          <w:tcPr/>
-          <w:p>
-            <w:pPr>
-              <w:pStyle w:val="Compact"/>
-              <w:jc w:val="left"/>
-            </w:pPr>
-            <w:r>
-              <w:t xml:space="preserve">Лид (DevOps) + QA-лид Григорий + DevOps-инженер + QA-автоматизатор</w:t>
+              <w:t xml:space="preserve">Григорий Витрик</w:t>
+            </w:r>
+          </w:p>
+        </w:tc>
+        <w:tc>
+          <w:tcPr/>
+          <w:p>
+            <w:pPr>
+              <w:pStyle w:val="Compact"/>
+              <w:jc w:val="left"/>
+            </w:pPr>
+            <w:r>
+              <w:t xml:space="preserve">Григорий (тесты, приемка), Александр (база, CI, стек — как DevOps по семинару 1)</w:t>
             </w:r>
           </w:p>
         </w:tc>
@@ -10511,7 +10470,7 @@
               <w:jc w:val="left"/>
             </w:pPr>
             <w:r>
-              <w:t xml:space="preserve">Богдан (DATA), Арина (CORE), Максим (APP), Александр (PLAT)</w:t>
+              <w:t xml:space="preserve">Богдан (DATA), Арина (CORE), Александр (APP, бэкенд; фронтенд — Максим), Григорий (PLAT)</w:t>
             </w:r>
           </w:p>
         </w:tc>
@@ -13526,7 +13485,7 @@
       <w:r>
         <w:drawing>
           <wp:inline>
-            <wp:extent cx="5334000" cy="3420427"/>
+            <wp:extent cx="5334000" cy="3278187"/>
             <wp:effectExtent b="0" l="0" r="0" t="0"/>
             <wp:docPr descr="Схема распределения команд и ответственности EcoGrid Flow" title="" id="64" name="Picture"/>
             <a:graphic>
@@ -13547,7 +13506,7 @@
                   <pic:spPr bwMode="auto">
                     <a:xfrm>
                       <a:off x="0" y="0"/>
-                      <a:ext cx="5334000" cy="3420427"/>
+                      <a:ext cx="5334000" cy="3278187"/>
                     </a:xfrm>
                     <a:prstGeom prst="rect">
                       <a:avLst/>
@@ -14039,6 +13998,72 @@
             </w:pPr>
             <w:r>
               <w:t xml:space="preserve">Первая версия: 4 функциональные области и 4 команды, 17 компонентов с ответственными, 8 общих компонентов, контракты CT-01…CT-07, реестр зависимостей X-01…X-12, порядок координации, единый DoD, правила Git и интеграции, 3 схемы</w:t>
+            </w:r>
+          </w:p>
+        </w:tc>
+      </w:tr>
+      <w:tr>
+        <w:tc>
+          <w:tcPr/>
+          <w:p>
+            <w:pPr>
+              <w:pStyle w:val="Compact"/>
+              <w:jc w:val="center"/>
+            </w:pPr>
+            <w:r>
+              <w:rPr>
+                <w:b/>
+                <w:bCs/>
+              </w:rPr>
+              <w:t xml:space="preserve">v1.1</w:t>
+            </w:r>
+          </w:p>
+        </w:tc>
+        <w:tc>
+          <w:tcPr/>
+          <w:p>
+            <w:pPr>
+              <w:pStyle w:val="Compact"/>
+              <w:jc w:val="center"/>
+            </w:pPr>
+            <w:r>
+              <w:t xml:space="preserve">22.10.2026</w:t>
+            </w:r>
+          </w:p>
+        </w:tc>
+        <w:tc>
+          <w:tcPr/>
+          <w:p>
+            <w:pPr>
+              <w:pStyle w:val="Compact"/>
+              <w:jc w:val="left"/>
+            </w:pPr>
+            <w:r>
+              <w:t xml:space="preserve">Богдан Леонов</w:t>
+            </w:r>
+          </w:p>
+        </w:tc>
+        <w:tc>
+          <w:tcPr/>
+          <w:p>
+            <w:pPr>
+              <w:pStyle w:val="Compact"/>
+              <w:jc w:val="left"/>
+            </w:pPr>
+            <w:r>
+              <w:t xml:space="preserve">На согласовании</w:t>
+            </w:r>
+          </w:p>
+        </w:tc>
+        <w:tc>
+          <w:tcPr/>
+          <w:p>
+            <w:pPr>
+              <w:pStyle w:val="Compact"/>
+              <w:jc w:val="left"/>
+            </w:pPr>
+            <w:r>
+              <w:t xml:space="preserve">Лиды команд приведены к ролям из семинара 1: «Продукт» (API и веб) ведет Александр Зейферт, фронтенд — Максим Томов; «Платформа и качество» ведет Григорий Витрик. Убрана численность команд при росте: модель масштабирования — гипотетическая, по заданию семинара, состав проекта — 5 человек</w:t>
             </w:r>
           </w:p>
         </w:tc>

</xml_diff>